<commit_message>
nmv 07 10 2026
</commit_message>
<xml_diff>
--- a/TS-Kramam/TS-4.7/TS 4.7 Malayalam Krama Paatam Corrections.docx
+++ b/TS-Kramam/TS-4.7/TS 4.7 Malayalam Krama Paatam Corrections.docx
@@ -89,10 +89,9 @@
           <w:bCs/>
           <w:sz w:val="32"/>
           <w:szCs w:val="32"/>
-          <w:highlight w:val="red"/>
           <w:u w:val="single"/>
         </w:rPr>
-        <w:t>?????</w:t>
+        <w:t>30th Sep 2026</w:t>
       </w:r>
     </w:p>
     <w:p>
@@ -2966,10 +2965,7 @@
           <w:lang w:val="it-IT"/>
         </w:rPr>
       </w:pPr>
-    </w:p>
-    <w:p>
-      <w:pPr>
-        <w:jc w:val="center"/>
+      <w:r>
         <w:rPr>
           <w:b/>
           <w:bCs/>
@@ -2978,7 +2974,8 @@
           <w:u w:val="single"/>
           <w:lang w:val="it-IT"/>
         </w:rPr>
-      </w:pPr>
+        <w:t>==========</w:t>
+      </w:r>
     </w:p>
     <w:p>
       <w:pPr>

</xml_diff>